<commit_message>
ajouter la deuxieme template pour cv simplifié
</commit_message>
<xml_diff>
--- a/backend/templates/template_maltem.docx
+++ b/backend/templates/template_maltem.docx
@@ -20,7 +20,7 @@
           <w:noProof/>
         </w:rPr>
         <w:drawing>
-          <wp:anchor distT="0" distB="0" distL="114300" distR="114300" simplePos="0" relativeHeight="251686912" behindDoc="0" locked="0" layoutInCell="1" allowOverlap="1" wp14:anchorId="1E60CE19" wp14:editId="54B6C1FB">
+          <wp:anchor distT="0" distB="0" distL="114300" distR="114300" simplePos="0" relativeHeight="251686912" behindDoc="0" locked="0" layoutInCell="1" allowOverlap="1" wp14:anchorId="1E60CE19" wp14:editId="322E0A72">
             <wp:simplePos x="0" y="0"/>
             <wp:positionH relativeFrom="page">
               <wp:posOffset>4852434</wp:posOffset>
@@ -742,6 +742,8 @@
         <w:spacing w:after="120" w:line="240" w:lineRule="auto"/>
         <w:rPr>
           <w:rFonts w:ascii="Century Gothic" w:eastAsia="Century Gothic" w:hAnsi="Century Gothic" w:cs="Century Gothic"/>
+          <w:b/>
+          <w:bCs/>
           <w:sz w:val="20"/>
           <w:szCs w:val="20"/>
           <w:lang w:val="en-DE"/>
@@ -750,6 +752,8 @@
       <w:r>
         <w:rPr>
           <w:rFonts w:ascii="Century Gothic" w:eastAsia="Century Gothic" w:hAnsi="Century Gothic" w:cs="Century Gothic"/>
+          <w:b/>
+          <w:bCs/>
           <w:sz w:val="20"/>
           <w:szCs w:val="20"/>
           <w:lang w:val="en-DE"/>
@@ -880,6 +884,8 @@
         <w:spacing w:after="120" w:line="240" w:lineRule="auto"/>
         <w:rPr>
           <w:rFonts w:ascii="Century Gothic" w:eastAsia="Century Gothic" w:hAnsi="Century Gothic" w:cs="Century Gothic"/>
+          <w:b/>
+          <w:bCs/>
           <w:sz w:val="20"/>
           <w:szCs w:val="20"/>
           <w:lang w:val="en-DE"/>
@@ -888,6 +894,8 @@
       <w:r>
         <w:rPr>
           <w:rFonts w:ascii="Century Gothic" w:eastAsia="Century Gothic" w:hAnsi="Century Gothic" w:cs="Century Gothic"/>
+          <w:b/>
+          <w:bCs/>
           <w:sz w:val="20"/>
           <w:szCs w:val="20"/>
           <w:lang w:val="en-DE"/>
@@ -1054,6 +1062,8 @@
         <w:contextualSpacing w:val="0"/>
         <w:rPr>
           <w:rFonts w:ascii="Century Gothic" w:eastAsia="Century Gothic" w:hAnsi="Century Gothic" w:cs="Century Gothic"/>
+          <w:b/>
+          <w:bCs/>
           <w:color w:val="111111"/>
           <w:sz w:val="18"/>
           <w:szCs w:val="18"/>
@@ -1063,6 +1073,8 @@
       <w:r>
         <w:rPr>
           <w:rFonts w:ascii="Century Gothic" w:eastAsia="Century Gothic" w:hAnsi="Century Gothic" w:cs="Century Gothic"/>
+          <w:b/>
+          <w:bCs/>
           <w:color w:val="111111"/>
           <w:sz w:val="18"/>
           <w:szCs w:val="18"/>
@@ -1219,6 +1231,8 @@
         <w:contextualSpacing w:val="0"/>
         <w:rPr>
           <w:rFonts w:ascii="Century Gothic" w:eastAsia="Century Gothic" w:hAnsi="Century Gothic" w:cs="Century Gothic"/>
+          <w:b/>
+          <w:bCs/>
           <w:color w:val="111111"/>
           <w:sz w:val="18"/>
           <w:szCs w:val="18"/>
@@ -1228,6 +1242,8 @@
       <w:r>
         <w:rPr>
           <w:rFonts w:ascii="Century Gothic" w:eastAsia="Century Gothic" w:hAnsi="Century Gothic" w:cs="Century Gothic"/>
+          <w:b/>
+          <w:bCs/>
           <w:color w:val="111111"/>
           <w:sz w:val="18"/>
           <w:szCs w:val="18"/>
@@ -1350,7 +1366,6 @@
           <w:color w:val="111111"/>
           <w:sz w:val="20"/>
           <w:szCs w:val="20"/>
-          <w:lang w:val="en-US"/>
         </w:rPr>
       </w:pPr>
     </w:p>
@@ -1368,7 +1383,6 @@
           <w:color w:val="111111"/>
           <w:sz w:val="20"/>
           <w:szCs w:val="20"/>
-          <w:lang w:val="en-US"/>
         </w:rPr>
       </w:pPr>
     </w:p>
@@ -1386,7 +1400,6 @@
           <w:color w:val="111111"/>
           <w:sz w:val="20"/>
           <w:szCs w:val="20"/>
-          <w:lang w:val="en-US"/>
         </w:rPr>
       </w:pPr>
     </w:p>
@@ -1404,7 +1417,6 @@
           <w:color w:val="111111"/>
           <w:sz w:val="20"/>
           <w:szCs w:val="20"/>
-          <w:lang w:val="en-US"/>
         </w:rPr>
       </w:pPr>
     </w:p>
@@ -1422,7 +1434,6 @@
           <w:color w:val="111111"/>
           <w:sz w:val="20"/>
           <w:szCs w:val="20"/>
-          <w:lang w:val="en-US"/>
         </w:rPr>
       </w:pPr>
     </w:p>
@@ -1440,7 +1451,6 @@
           <w:color w:val="111111"/>
           <w:sz w:val="20"/>
           <w:szCs w:val="20"/>
-          <w:lang w:val="en-US"/>
         </w:rPr>
       </w:pPr>
     </w:p>
@@ -2226,39 +2236,33 @@
           <w:rFonts w:ascii="Century Gothic" w:eastAsia="Century Gothic" w:hAnsi="Century Gothic" w:cs="Century Gothic"/>
           <w:sz w:val="20"/>
           <w:szCs w:val="20"/>
-          <w:lang w:val="en-US"/>
-        </w:rPr>
-      </w:pPr>
-      <w:r>
-        <w:rPr>
-          <w:rFonts w:ascii="Century Gothic" w:eastAsia="Century Gothic" w:hAnsi="Century Gothic" w:cs="Century Gothic"/>
-          <w:sz w:val="20"/>
-          <w:szCs w:val="20"/>
-          <w:lang w:val="en-US"/>
+        </w:rPr>
+      </w:pPr>
+      <w:r>
+        <w:rPr>
+          <w:rFonts w:ascii="Century Gothic" w:eastAsia="Century Gothic" w:hAnsi="Century Gothic" w:cs="Century Gothic"/>
+          <w:sz w:val="20"/>
+          <w:szCs w:val="20"/>
         </w:rPr>
         <w:t xml:space="preserve">{% if </w:t>
       </w:r>
-      <w:proofErr w:type="spellStart"/>
       <w:proofErr w:type="gramStart"/>
       <w:r>
         <w:rPr>
           <w:rFonts w:ascii="Century Gothic" w:eastAsia="Century Gothic" w:hAnsi="Century Gothic" w:cs="Century Gothic"/>
           <w:sz w:val="20"/>
           <w:szCs w:val="20"/>
-          <w:lang w:val="en-US"/>
         </w:rPr>
         <w:t>exp.client</w:t>
       </w:r>
-      <w:proofErr w:type="spellEnd"/>
       <w:proofErr w:type="gramEnd"/>
       <w:r>
         <w:rPr>
           <w:rFonts w:ascii="Century Gothic" w:eastAsia="Century Gothic" w:hAnsi="Century Gothic" w:cs="Century Gothic"/>
           <w:sz w:val="20"/>
           <w:szCs w:val="20"/>
-          <w:lang w:val="en-US"/>
-        </w:rPr>
-        <w:t xml:space="preserve"> %}– Client </w:t>
+        </w:rPr>
+        <w:t xml:space="preserve"> </w:t>
       </w:r>
       <w:proofErr w:type="gramStart"/>
       <w:r>
@@ -2266,19 +2270,8 @@
           <w:rFonts w:ascii="Century Gothic" w:eastAsia="Century Gothic" w:hAnsi="Century Gothic" w:cs="Century Gothic"/>
           <w:sz w:val="20"/>
           <w:szCs w:val="20"/>
-          <w:lang w:val="en-US"/>
-        </w:rPr>
-        <w:t xml:space="preserve">{{ </w:t>
-      </w:r>
-      <w:proofErr w:type="spellStart"/>
-      <w:r>
-        <w:rPr>
-          <w:rFonts w:ascii="Century Gothic" w:eastAsia="Century Gothic" w:hAnsi="Century Gothic" w:cs="Century Gothic"/>
-          <w:sz w:val="20"/>
-          <w:szCs w:val="20"/>
-          <w:lang w:val="en-US"/>
-        </w:rPr>
-        <w:t>exp</w:t>
+        </w:rPr>
+        <w:t>%}–</w:t>
       </w:r>
       <w:proofErr w:type="gramEnd"/>
       <w:r>
@@ -2286,7 +2279,24 @@
           <w:rFonts w:ascii="Century Gothic" w:eastAsia="Century Gothic" w:hAnsi="Century Gothic" w:cs="Century Gothic"/>
           <w:sz w:val="20"/>
           <w:szCs w:val="20"/>
-          <w:lang w:val="en-US"/>
+        </w:rPr>
+        <w:t xml:space="preserve"> Client </w:t>
+      </w:r>
+      <w:proofErr w:type="gramStart"/>
+      <w:r>
+        <w:rPr>
+          <w:rFonts w:ascii="Century Gothic" w:eastAsia="Century Gothic" w:hAnsi="Century Gothic" w:cs="Century Gothic"/>
+          <w:sz w:val="20"/>
+          <w:szCs w:val="20"/>
+        </w:rPr>
+        <w:t>{{ exp</w:t>
+      </w:r>
+      <w:proofErr w:type="gramEnd"/>
+      <w:r>
+        <w:rPr>
+          <w:rFonts w:ascii="Century Gothic" w:eastAsia="Century Gothic" w:hAnsi="Century Gothic" w:cs="Century Gothic"/>
+          <w:sz w:val="20"/>
+          <w:szCs w:val="20"/>
         </w:rPr>
         <w:t>.</w:t>
       </w:r>
@@ -2296,19 +2306,8 @@
           <w:rFonts w:ascii="Century Gothic" w:eastAsia="Century Gothic" w:hAnsi="Century Gothic" w:cs="Century Gothic"/>
           <w:sz w:val="20"/>
           <w:szCs w:val="20"/>
-          <w:lang w:val="en-US"/>
-        </w:rPr>
-        <w:t>client</w:t>
-      </w:r>
-      <w:proofErr w:type="spellEnd"/>
-      <w:r>
-        <w:rPr>
-          <w:rFonts w:ascii="Century Gothic" w:eastAsia="Century Gothic" w:hAnsi="Century Gothic" w:cs="Century Gothic"/>
-          <w:sz w:val="20"/>
-          <w:szCs w:val="20"/>
-          <w:lang w:val="en-US"/>
-        </w:rPr>
-        <w:t xml:space="preserve"> }}{</w:t>
+        </w:rPr>
+        <w:t>client }}{</w:t>
       </w:r>
       <w:proofErr w:type="gramEnd"/>
       <w:r>
@@ -2316,7 +2315,6 @@
           <w:rFonts w:ascii="Century Gothic" w:eastAsia="Century Gothic" w:hAnsi="Century Gothic" w:cs="Century Gothic"/>
           <w:sz w:val="20"/>
           <w:szCs w:val="20"/>
-          <w:lang w:val="en-US"/>
         </w:rPr>
         <w:t>% endif %}</w:t>
       </w:r>
@@ -2422,10 +2420,20 @@
       <w:r>
         <w:rPr>
           <w:rFonts w:ascii="Century Gothic" w:eastAsia="Century Gothic" w:hAnsi="Century Gothic" w:cs="Century Gothic"/>
-          <w:sz w:val="20"/>
-          <w:szCs w:val="20"/>
-        </w:rPr>
-        <w:t xml:space="preserve">Projet : </w:t>
+          <w:b/>
+          <w:bCs/>
+          <w:sz w:val="20"/>
+          <w:szCs w:val="20"/>
+        </w:rPr>
+        <w:t>Projet :</w:t>
+      </w:r>
+      <w:r>
+        <w:rPr>
+          <w:rFonts w:ascii="Century Gothic" w:eastAsia="Century Gothic" w:hAnsi="Century Gothic" w:cs="Century Gothic"/>
+          <w:sz w:val="20"/>
+          <w:szCs w:val="20"/>
+        </w:rPr>
+        <w:t xml:space="preserve"> </w:t>
       </w:r>
       <w:proofErr w:type="gramStart"/>
       <w:r>
@@ -2499,10 +2507,20 @@
       <w:r>
         <w:rPr>
           <w:rFonts w:ascii="Century Gothic" w:eastAsia="Century Gothic" w:hAnsi="Century Gothic" w:cs="Century Gothic"/>
-          <w:sz w:val="20"/>
-          <w:szCs w:val="20"/>
-        </w:rPr>
-        <w:t xml:space="preserve">Rôle : </w:t>
+          <w:b/>
+          <w:bCs/>
+          <w:sz w:val="20"/>
+          <w:szCs w:val="20"/>
+        </w:rPr>
+        <w:t>Rôle :</w:t>
+      </w:r>
+      <w:r>
+        <w:rPr>
+          <w:rFonts w:ascii="Century Gothic" w:eastAsia="Century Gothic" w:hAnsi="Century Gothic" w:cs="Century Gothic"/>
+          <w:sz w:val="20"/>
+          <w:szCs w:val="20"/>
+        </w:rPr>
+        <w:t xml:space="preserve"> </w:t>
       </w:r>
       <w:proofErr w:type="gramStart"/>
       <w:r>
@@ -2584,13 +2602,17 @@
         <w:ind w:left="3850"/>
         <w:rPr>
           <w:rFonts w:ascii="Century Gothic" w:eastAsia="Century Gothic" w:hAnsi="Century Gothic" w:cs="Century Gothic"/>
-          <w:sz w:val="20"/>
-          <w:szCs w:val="20"/>
-        </w:rPr>
-      </w:pPr>
-      <w:r>
-        <w:rPr>
-          <w:rFonts w:ascii="Century Gothic" w:eastAsia="Century Gothic" w:hAnsi="Century Gothic" w:cs="Century Gothic"/>
+          <w:b/>
+          <w:bCs/>
+          <w:sz w:val="20"/>
+          <w:szCs w:val="20"/>
+        </w:rPr>
+      </w:pPr>
+      <w:r>
+        <w:rPr>
+          <w:rFonts w:ascii="Century Gothic" w:eastAsia="Century Gothic" w:hAnsi="Century Gothic" w:cs="Century Gothic"/>
+          <w:b/>
+          <w:bCs/>
           <w:sz w:val="20"/>
           <w:szCs w:val="20"/>
         </w:rPr>
@@ -2691,13 +2713,17 @@
         <w:ind w:left="3850"/>
         <w:rPr>
           <w:rFonts w:ascii="Century Gothic" w:eastAsia="Century Gothic" w:hAnsi="Century Gothic" w:cs="Century Gothic"/>
-          <w:sz w:val="20"/>
-          <w:szCs w:val="20"/>
-        </w:rPr>
-      </w:pPr>
-      <w:r>
-        <w:rPr>
-          <w:rFonts w:ascii="Century Gothic" w:eastAsia="Century Gothic" w:hAnsi="Century Gothic" w:cs="Century Gothic"/>
+          <w:b/>
+          <w:bCs/>
+          <w:sz w:val="20"/>
+          <w:szCs w:val="20"/>
+        </w:rPr>
+      </w:pPr>
+      <w:r>
+        <w:rPr>
+          <w:rFonts w:ascii="Century Gothic" w:eastAsia="Century Gothic" w:hAnsi="Century Gothic" w:cs="Century Gothic"/>
+          <w:b/>
+          <w:bCs/>
           <w:sz w:val="20"/>
           <w:szCs w:val="20"/>
         </w:rPr>
@@ -2798,22 +2824,22 @@
         <w:ind w:left="3850"/>
         <w:rPr>
           <w:rFonts w:ascii="Century Gothic" w:eastAsia="Century Gothic" w:hAnsi="Century Gothic" w:cs="Century Gothic"/>
-          <w:sz w:val="20"/>
-          <w:szCs w:val="20"/>
-          <w:lang w:val="en-US"/>
-        </w:rPr>
-      </w:pPr>
-      <w:proofErr w:type="spellStart"/>
-      <w:r>
-        <w:rPr>
-          <w:rFonts w:ascii="Century Gothic" w:eastAsia="Century Gothic" w:hAnsi="Century Gothic" w:cs="Century Gothic"/>
-          <w:sz w:val="20"/>
-          <w:szCs w:val="20"/>
-          <w:lang w:val="en-US"/>
+          <w:b/>
+          <w:bCs/>
+          <w:sz w:val="20"/>
+          <w:szCs w:val="20"/>
+        </w:rPr>
+      </w:pPr>
+      <w:r>
+        <w:rPr>
+          <w:rFonts w:ascii="Century Gothic" w:eastAsia="Century Gothic" w:hAnsi="Century Gothic" w:cs="Century Gothic"/>
+          <w:b/>
+          <w:bCs/>
+          <w:sz w:val="20"/>
+          <w:szCs w:val="20"/>
         </w:rPr>
         <w:t>Réalisations</w:t>
       </w:r>
-      <w:proofErr w:type="spellEnd"/>
     </w:p>
     <w:p>
       <w:pPr>
@@ -2978,6 +3004,8 @@
         <w:ind w:left="3850"/>
         <w:rPr>
           <w:rFonts w:ascii="Century Gothic" w:eastAsia="Century Gothic" w:hAnsi="Century Gothic" w:cs="Century Gothic"/>
+          <w:b/>
+          <w:bCs/>
           <w:sz w:val="20"/>
           <w:szCs w:val="20"/>
           <w:lang w:val="en-US"/>
@@ -2987,6 +3015,8 @@
       <w:r>
         <w:rPr>
           <w:rFonts w:ascii="Century Gothic" w:eastAsia="Century Gothic" w:hAnsi="Century Gothic" w:cs="Century Gothic"/>
+          <w:b/>
+          <w:bCs/>
           <w:sz w:val="20"/>
           <w:szCs w:val="20"/>
           <w:lang w:val="en-US"/>
@@ -2997,6 +3027,8 @@
       <w:r>
         <w:rPr>
           <w:rFonts w:ascii="Century Gothic" w:eastAsia="Century Gothic" w:hAnsi="Century Gothic" w:cs="Century Gothic"/>
+          <w:b/>
+          <w:bCs/>
           <w:sz w:val="20"/>
           <w:szCs w:val="20"/>
           <w:lang w:val="en-US"/>
@@ -3063,13 +3095,15 @@
           <w:rFonts w:ascii="Century Gothic" w:eastAsia="Century Gothic" w:hAnsi="Century Gothic" w:cs="Century Gothic"/>
           <w:sz w:val="20"/>
           <w:szCs w:val="20"/>
-        </w:rPr>
-      </w:pPr>
-      <w:r>
-        <w:rPr>
-          <w:rFonts w:ascii="Century Gothic" w:eastAsia="Century Gothic" w:hAnsi="Century Gothic" w:cs="Century Gothic"/>
-          <w:sz w:val="20"/>
-          <w:szCs w:val="20"/>
+          <w:lang w:val="en-US"/>
+        </w:rPr>
+      </w:pPr>
+      <w:r>
+        <w:rPr>
+          <w:rFonts w:ascii="Century Gothic" w:eastAsia="Century Gothic" w:hAnsi="Century Gothic" w:cs="Century Gothic"/>
+          <w:sz w:val="20"/>
+          <w:szCs w:val="20"/>
+          <w:lang w:val="en-US"/>
         </w:rPr>
         <w:t xml:space="preserve">• </w:t>
       </w:r>
@@ -3079,25 +3113,17 @@
           <w:rFonts w:ascii="Century Gothic" w:eastAsia="Century Gothic" w:hAnsi="Century Gothic" w:cs="Century Gothic"/>
           <w:sz w:val="20"/>
           <w:szCs w:val="20"/>
-        </w:rPr>
-        <w:t xml:space="preserve">{{ </w:t>
-      </w:r>
-      <w:proofErr w:type="spellStart"/>
-      <w:r>
-        <w:rPr>
-          <w:rFonts w:ascii="Century Gothic" w:eastAsia="Century Gothic" w:hAnsi="Century Gothic" w:cs="Century Gothic"/>
-          <w:sz w:val="20"/>
-          <w:szCs w:val="20"/>
-        </w:rPr>
-        <w:t>res</w:t>
-      </w:r>
-      <w:proofErr w:type="spellEnd"/>
+          <w:lang w:val="en-US"/>
+        </w:rPr>
+        <w:t>{{ res</w:t>
+      </w:r>
       <w:proofErr w:type="gramEnd"/>
       <w:r>
         <w:rPr>
           <w:rFonts w:ascii="Century Gothic" w:eastAsia="Century Gothic" w:hAnsi="Century Gothic" w:cs="Century Gothic"/>
           <w:sz w:val="20"/>
           <w:szCs w:val="20"/>
+          <w:lang w:val="en-US"/>
         </w:rPr>
         <w:t xml:space="preserve"> }}</w:t>
       </w:r>
@@ -3114,33 +3140,17 @@
           <w:rFonts w:ascii="Century Gothic" w:eastAsia="Century Gothic" w:hAnsi="Century Gothic" w:cs="Century Gothic"/>
           <w:sz w:val="20"/>
           <w:szCs w:val="20"/>
-        </w:rPr>
-      </w:pPr>
-      <w:r>
-        <w:rPr>
-          <w:rFonts w:ascii="Century Gothic" w:eastAsia="Century Gothic" w:hAnsi="Century Gothic" w:cs="Century Gothic"/>
-          <w:sz w:val="20"/>
-          <w:szCs w:val="20"/>
-        </w:rPr>
-        <w:t xml:space="preserve">{% </w:t>
-      </w:r>
-      <w:proofErr w:type="spellStart"/>
-      <w:r>
-        <w:rPr>
-          <w:rFonts w:ascii="Century Gothic" w:eastAsia="Century Gothic" w:hAnsi="Century Gothic" w:cs="Century Gothic"/>
-          <w:sz w:val="20"/>
-          <w:szCs w:val="20"/>
-        </w:rPr>
-        <w:t>endfor</w:t>
-      </w:r>
-      <w:proofErr w:type="spellEnd"/>
-      <w:r>
-        <w:rPr>
-          <w:rFonts w:ascii="Century Gothic" w:eastAsia="Century Gothic" w:hAnsi="Century Gothic" w:cs="Century Gothic"/>
-          <w:sz w:val="20"/>
-          <w:szCs w:val="20"/>
-        </w:rPr>
-        <w:t xml:space="preserve"> %}</w:t>
+          <w:lang w:val="en-US"/>
+        </w:rPr>
+      </w:pPr>
+      <w:r>
+        <w:rPr>
+          <w:rFonts w:ascii="Century Gothic" w:eastAsia="Century Gothic" w:hAnsi="Century Gothic" w:cs="Century Gothic"/>
+          <w:sz w:val="20"/>
+          <w:szCs w:val="20"/>
+          <w:lang w:val="en-US"/>
+        </w:rPr>
+        <w:t>{% endfor %}</w:t>
       </w:r>
     </w:p>
     <w:p>
@@ -3155,6 +3165,7 @@
           <w:rFonts w:ascii="Century Gothic" w:eastAsia="Century Gothic" w:hAnsi="Century Gothic" w:cs="Century Gothic"/>
           <w:sz w:val="20"/>
           <w:szCs w:val="20"/>
+          <w:lang w:val="en-US"/>
         </w:rPr>
       </w:pPr>
     </w:p>
@@ -3168,15 +3179,21 @@
         <w:ind w:left="3850"/>
         <w:rPr>
           <w:rFonts w:ascii="Century Gothic" w:eastAsia="Century Gothic" w:hAnsi="Century Gothic" w:cs="Century Gothic"/>
-          <w:sz w:val="20"/>
-          <w:szCs w:val="20"/>
-        </w:rPr>
-      </w:pPr>
-      <w:r>
-        <w:rPr>
-          <w:rFonts w:ascii="Century Gothic" w:eastAsia="Century Gothic" w:hAnsi="Century Gothic" w:cs="Century Gothic"/>
-          <w:sz w:val="20"/>
-          <w:szCs w:val="20"/>
+          <w:b/>
+          <w:bCs/>
+          <w:sz w:val="20"/>
+          <w:szCs w:val="20"/>
+          <w:lang w:val="en-US"/>
+        </w:rPr>
+      </w:pPr>
+      <w:r>
+        <w:rPr>
+          <w:rFonts w:ascii="Century Gothic" w:eastAsia="Century Gothic" w:hAnsi="Century Gothic" w:cs="Century Gothic"/>
+          <w:b/>
+          <w:bCs/>
+          <w:sz w:val="20"/>
+          <w:szCs w:val="20"/>
+          <w:lang w:val="en-US"/>
         </w:rPr>
         <w:t>Environnement</w:t>
       </w:r>
@@ -3193,6 +3210,7 @@
           <w:rFonts w:ascii="Century Gothic" w:eastAsia="Century Gothic" w:hAnsi="Century Gothic" w:cs="Century Gothic"/>
           <w:sz w:val="20"/>
           <w:szCs w:val="20"/>
+          <w:lang w:val="en-US"/>
         </w:rPr>
       </w:pPr>
       <w:proofErr w:type="gramStart"/>
@@ -3201,17 +3219,9 @@
           <w:rFonts w:ascii="Century Gothic" w:eastAsia="Century Gothic" w:hAnsi="Century Gothic" w:cs="Century Gothic"/>
           <w:sz w:val="20"/>
           <w:szCs w:val="20"/>
-        </w:rPr>
-        <w:t xml:space="preserve">{{ </w:t>
-      </w:r>
-      <w:proofErr w:type="spellStart"/>
-      <w:r>
-        <w:rPr>
-          <w:rFonts w:ascii="Century Gothic" w:eastAsia="Century Gothic" w:hAnsi="Century Gothic" w:cs="Century Gothic"/>
-          <w:sz w:val="20"/>
-          <w:szCs w:val="20"/>
-        </w:rPr>
-        <w:t>exp</w:t>
+          <w:lang w:val="en-US"/>
+        </w:rPr>
+        <w:t>{{ exp</w:t>
       </w:r>
       <w:proofErr w:type="gramEnd"/>
       <w:r>
@@ -3219,6 +3229,7 @@
           <w:rFonts w:ascii="Century Gothic" w:eastAsia="Century Gothic" w:hAnsi="Century Gothic" w:cs="Century Gothic"/>
           <w:sz w:val="20"/>
           <w:szCs w:val="20"/>
+          <w:lang w:val="en-US"/>
         </w:rPr>
         <w:t>.</w:t>
       </w:r>
@@ -3228,17 +3239,9 @@
           <w:rFonts w:ascii="Century Gothic" w:eastAsia="Century Gothic" w:hAnsi="Century Gothic" w:cs="Century Gothic"/>
           <w:sz w:val="20"/>
           <w:szCs w:val="20"/>
-        </w:rPr>
-        <w:t>environnement</w:t>
-      </w:r>
-      <w:proofErr w:type="spellEnd"/>
-      <w:r>
-        <w:rPr>
-          <w:rFonts w:ascii="Century Gothic" w:eastAsia="Century Gothic" w:hAnsi="Century Gothic" w:cs="Century Gothic"/>
-          <w:sz w:val="20"/>
-          <w:szCs w:val="20"/>
-        </w:rPr>
-        <w:t xml:space="preserve"> }</w:t>
+          <w:lang w:val="en-US"/>
+        </w:rPr>
+        <w:t>environnement }</w:t>
       </w:r>
       <w:proofErr w:type="gramEnd"/>
       <w:r>
@@ -3246,6 +3249,7 @@
           <w:rFonts w:ascii="Century Gothic" w:eastAsia="Century Gothic" w:hAnsi="Century Gothic" w:cs="Century Gothic"/>
           <w:sz w:val="20"/>
           <w:szCs w:val="20"/>
+          <w:lang w:val="en-US"/>
         </w:rPr>
         <w:t>}</w:t>
       </w:r>
@@ -3262,6 +3266,7 @@
           <w:rFonts w:ascii="Century Gothic" w:eastAsia="Century Gothic" w:hAnsi="Century Gothic" w:cs="Century Gothic"/>
           <w:sz w:val="20"/>
           <w:szCs w:val="20"/>
+          <w:lang w:val="en-US"/>
         </w:rPr>
       </w:pPr>
     </w:p>
@@ -3319,6 +3324,7 @@
           <w:bCs/>
           <w:sz w:val="20"/>
           <w:szCs w:val="20"/>
+          <w:lang w:val="en-US"/>
         </w:rPr>
       </w:pPr>
       <w:r>
@@ -3328,6 +3334,7 @@
           <w:bCs/>
           <w:sz w:val="20"/>
           <w:szCs w:val="20"/>
+          <w:lang w:val="en-US"/>
         </w:rPr>
         <w:t xml:space="preserve"> </w:t>
       </w:r>
@@ -9987,9 +9994,7 @@
 </file>
 
 <file path=customXml/item1.xml><?xml version="1.0" encoding="utf-8"?>
-<go:gDocsCustomXmlDataStorage xmlns:go="http://customooxmlschemas.google.com/" xmlns:r="http://schemas.openxmlformats.org/officeDocument/2006/relationships">
-  <go:docsCustomData xmlns:go="http://customooxmlschemas.google.com/" roundtripDataSignature="AMtx7mjSD1PSd3vJPuuZ74KqQLIp71t5fA==">AMUW2mWORY+47SRRbuApNd0NMq3di7OfQqfRKMJUT16ADrNvSEPvbP6yo4goetaW5D/LI/tEENuLikfU6PRRKUfUA7Qf0aPJiybehgBfTMb+R7nwwAtU+9GHzM2+frUw7e/ij2x9+6svc+l/lWRB+xAfmNH8CHRe+0LI+MKczmYFThaQPm0oromAzVJwuB2IfcL0s0nVi7An</go:docsCustomData>
-</go:gDocsCustomXmlDataStorage>
+<b:Sources xmlns:b="http://schemas.openxmlformats.org/officeDocument/2006/bibliography" xmlns="http://schemas.openxmlformats.org/officeDocument/2006/bibliography" SelectedStyle="\APASixthEditionOfficeOnline.xsl" StyleName="APA" Version="6"/>
 </file>
 
 <file path=customXml/item2.xml><?xml version="1.0" encoding="utf-8"?>
@@ -10216,19 +10221,12 @@
 </file>
 
 <file path=customXml/item3.xml><?xml version="1.0" encoding="utf-8"?>
-<b:Sources xmlns:b="http://schemas.openxmlformats.org/officeDocument/2006/bibliography" xmlns="http://schemas.openxmlformats.org/officeDocument/2006/bibliography" SelectedStyle="\APASixthEditionOfficeOnline.xsl" StyleName="APA" Version="6"/>
+<go:gDocsCustomXmlDataStorage xmlns:go="http://customooxmlschemas.google.com/" xmlns:r="http://schemas.openxmlformats.org/officeDocument/2006/relationships">
+  <go:docsCustomData xmlns:go="http://customooxmlschemas.google.com/" roundtripDataSignature="AMtx7mjSD1PSd3vJPuuZ74KqQLIp71t5fA==">AMUW2mWORY+47SRRbuApNd0NMq3di7OfQqfRKMJUT16ADrNvSEPvbP6yo4goetaW5D/LI/tEENuLikfU6PRRKUfUA7Qf0aPJiybehgBfTMb+R7nwwAtU+9GHzM2+frUw7e/ij2x9+6svc+l/lWRB+xAfmNH8CHRe+0LI+MKczmYFThaQPm0oromAzVJwuB2IfcL0s0nVi7An</go:docsCustomData>
+</go:gDocsCustomXmlDataStorage>
 </file>
 
 <file path=customXml/item4.xml><?xml version="1.0" encoding="utf-8"?>
-<?mso-contentType ?>
-<FormTemplates xmlns="http://schemas.microsoft.com/sharepoint/v3/contenttype/forms">
-  <Display>DocumentLibraryForm</Display>
-  <Edit>DocumentLibraryForm</Edit>
-  <New>DocumentLibraryForm</New>
-</FormTemplates>
-</file>
-
-<file path=customXml/item5.xml><?xml version="1.0" encoding="utf-8"?>
 <p:properties xmlns:p="http://schemas.microsoft.com/office/2006/metadata/properties" xmlns:xsi="http://www.w3.org/2001/XMLSchema-instance" xmlns:pc="http://schemas.microsoft.com/office/infopath/2007/PartnerControls">
   <documentManagement>
     <lcf76f155ced4ddcb4097134ff3c332f xmlns="d6fa656f-835a-4bd6-980d-557baa631ad6">
@@ -10239,11 +10237,19 @@
 </p:properties>
 </file>
 
+<file path=customXml/item5.xml><?xml version="1.0" encoding="utf-8"?>
+<?mso-contentType ?>
+<FormTemplates xmlns="http://schemas.microsoft.com/sharepoint/v3/contenttype/forms">
+  <Display>DocumentLibraryForm</Display>
+  <Edit>DocumentLibraryForm</Edit>
+  <New>DocumentLibraryForm</New>
+</FormTemplates>
+</file>
+
 <file path=customXml/itemProps1.xml><?xml version="1.0" encoding="utf-8"?>
-<ds:datastoreItem xmlns:ds="http://schemas.openxmlformats.org/officeDocument/2006/customXml" ds:itemID="{11111111-1234-1234-1234-123412341234}">
+<ds:datastoreItem xmlns:ds="http://schemas.openxmlformats.org/officeDocument/2006/customXml" ds:itemID="{37DE214B-233D-4CD0-8671-EC398B61BBE0}">
   <ds:schemaRefs>
-    <ds:schemaRef ds:uri="http://customooxmlschemas.google.com/"/>
-    <ds:schemaRef ds:uri="http://schemas.openxmlformats.org/officeDocument/2006/relationships"/>
+    <ds:schemaRef ds:uri="http://schemas.openxmlformats.org/officeDocument/2006/bibliography"/>
   </ds:schemaRefs>
 </ds:datastoreItem>
 </file>
@@ -10268,22 +10274,15 @@
 </file>
 
 <file path=customXml/itemProps3.xml><?xml version="1.0" encoding="utf-8"?>
-<ds:datastoreItem xmlns:ds="http://schemas.openxmlformats.org/officeDocument/2006/customXml" ds:itemID="{37DE214B-233D-4CD0-8671-EC398B61BBE0}">
+<ds:datastoreItem xmlns:ds="http://schemas.openxmlformats.org/officeDocument/2006/customXml" ds:itemID="{11111111-1234-1234-1234-123412341234}">
   <ds:schemaRefs>
-    <ds:schemaRef ds:uri="http://schemas.openxmlformats.org/officeDocument/2006/bibliography"/>
+    <ds:schemaRef ds:uri="http://customooxmlschemas.google.com/"/>
+    <ds:schemaRef ds:uri="http://schemas.openxmlformats.org/officeDocument/2006/relationships"/>
   </ds:schemaRefs>
 </ds:datastoreItem>
 </file>
 
 <file path=customXml/itemProps4.xml><?xml version="1.0" encoding="utf-8"?>
-<ds:datastoreItem xmlns:ds="http://schemas.openxmlformats.org/officeDocument/2006/customXml" ds:itemID="{1BE625E7-0389-45F3-8FBC-8A81B1B0A21F}">
-  <ds:schemaRefs>
-    <ds:schemaRef ds:uri="http://schemas.microsoft.com/sharepoint/v3/contenttype/forms"/>
-  </ds:schemaRefs>
-</ds:datastoreItem>
-</file>
-
-<file path=customXml/itemProps5.xml><?xml version="1.0" encoding="utf-8"?>
 <ds:datastoreItem xmlns:ds="http://schemas.openxmlformats.org/officeDocument/2006/customXml" ds:itemID="{49EB3AF7-7DC0-4572-AA73-B374046DB1ED}">
   <ds:schemaRefs>
     <ds:schemaRef ds:uri="http://schemas.microsoft.com/office/2006/metadata/properties"/>
@@ -10292,4 +10291,12 @@
     <ds:schemaRef ds:uri="920d9a89-6f3e-42ce-9eb7-d7cf8ba8a559"/>
   </ds:schemaRefs>
 </ds:datastoreItem>
+</file>
+
+<file path=customXml/itemProps5.xml><?xml version="1.0" encoding="utf-8"?>
+<ds:datastoreItem xmlns:ds="http://schemas.openxmlformats.org/officeDocument/2006/customXml" ds:itemID="{1BE625E7-0389-45F3-8FBC-8A81B1B0A21F}">
+  <ds:schemaRefs>
+    <ds:schemaRef ds:uri="http://schemas.microsoft.com/sharepoint/v3/contenttype/forms"/>
+  </ds:schemaRefs>
+</ds:datastoreItem>
 </file>
</xml_diff>